<commit_message>
docs: mirror two-bound/rattle/thermal analysis into the Word report; refresh plan
Update build_docx.py so the docx mirrors the expanded HTML (13 sections): revised
two-bound summary, corrected §1 metrics (R_s=10m, M=9000t), distribution caveat,
rewritten §7/§8, and new §9 (polytope width), §10 (which bound), §11 (thermal
cycling + overdetermined loads), §12 (gap-distribution reliability + measurement).
Regenerate figures/data at R_s=10 for consistency; emit plan-impl in the pendulum
explainer. Refresh the reckon plan summary and queue the FE-thermal/VVLS/gap-measurement
followup.
</commit_message>
<xml_diff>
--- a/docs/vv-lateral-displacement-analysis.docx
+++ b/docs/vv-lateral-displacement-analysis.docx
@@ -40,7 +40,7 @@
           <w:color w:val="555555"/>
           <w:sz w:val="17"/>
         </w:rPr>
-        <w:t>5,000-sample Monte Carlo  ·  scipy HiGHS LP  ·  3-DOF rigid-body model  ·  metric: max lateral displacement of the VV centre from the gravitational centre (n = 1 first-wall shift)</w:t>
+        <w:t>5,000-sample Monte Carlo  ·  scipy HiGHS LP  ·  3-DOF rigid-body model  ·  two metrics: departure-from-centre (frictionless) and polytope width (stiction walk)  ·  R_s ≈ 10 m, M ≈ 9000 t (ITER_D_6TLUDY)</w:t>
       </w:r>
     </w:p>
     <w:tbl>
@@ -56,14 +56,14 @@
         <w:tc>
           <w:tcPr>
             <w:tcW w:type="dxa" w:w="8640"/>
-            <w:shd w:val="clear" w:fill="e8efff"/>
+            <w:shd w:val="clear" w:fill="fff0ee"/>
             <w:tcBorders>
-              <w:left w:val="single" w:sz="24" w:color="2255aa"/>
+              <w:left w:val="single" w:sz="24" w:color="cc2200"/>
             </w:tcBorders>
             <w:tcBorders>
-              <w:top w:val="single" w:sz="4" w:color="e8efff"/>
-              <w:bottom w:val="single" w:sz="4" w:color="e8efff"/>
-              <w:right w:val="single" w:sz="4" w:color="e8efff"/>
+              <w:top w:val="single" w:sz="4" w:color="fff0ee"/>
+              <w:bottom w:val="single" w:sz="4" w:color="fff0ee"/>
+              <w:right w:val="single" w:sz="4" w:color="fff0ee"/>
             </w:tcBorders>
           </w:tcPr>
           <w:p>
@@ -73,7 +73,7 @@
             <w:r>
               <w:rPr>
                 <w:b/>
-                <w:color w:val="2255AA"/>
+                <w:color w:val="CC2200"/>
               </w:rPr>
               <w:t xml:space="preserve">Summary of findings:  </w:t>
             </w:r>
@@ -82,54 +82,68 @@
                 <w:b w:val="0"/>
                 <w:sz w:val="20"/>
               </w:rPr>
-              <w:t xml:space="preserve">The vacuum vessel rests on 9 inward-inclined gravity supports whose 15° tilt provides a gravitational centring force in the lateral plane: </w:t>
+              <w:t>The vessel rests on nine inward-inclined (15°) gravity supports that form a soft lateral gravitational pendulum (K ≈ 2.7 kN/mm, T_n ≈ 11 s). Whether the vessel actually self-centres is decided by friction, and that selects between two bounds:</w:t>
+              <w:br/>
+              <w:br/>
             </w:r>
             <w:r>
               <w:rPr>
                 <w:b/>
                 <w:sz w:val="20"/>
               </w:rPr>
-              <w:t>the vessel self-centres at rest and departs from the machine axis only under an applied lateral force</w:t>
+              <w:t xml:space="preserve">• Frictionless lower bound — self-centring (§3–§6). </w:t>
             </w:r>
             <w:r>
               <w:rPr>
                 <w:b w:val="0"/>
                 <w:sz w:val="20"/>
               </w:rPr>
-              <w:t>. The natural period of this pendulum is ≈ 10 s.</w:t>
+              <w:t>If the supports slid freely the vessel would return to the gravitational centre at rest (≈ 0 contribution to the n = 1 shift); only forced excursions would reach the departure envelope — nominal 1.55 mm, distribution-dependent tail to ~3.0 mm.</w:t>
               <w:br/>
-              <w:br/>
+            </w:r>
+            <w:r>
+              <w:rPr>
+                <w:b/>
+                <w:sz w:val="20"/>
+              </w:rPr>
+              <w:t xml:space="preserve">• Realistic bound — stiction walk (§10). </w:t>
             </w:r>
             <w:r>
               <w:rPr>
                 <w:b w:val="0"/>
                 <w:sz w:val="20"/>
               </w:rPr>
-              <w:t>• The n = 1 first-wall metric is the maximum lateral displacement of the VV centre from the machine axis. Nominal envelope 1.55 mm; across the assembly population (Monte Carlo, §5) P95 = 2.27 mm, max = 2.98 mm; at-rest contribution = 0.</w:t>
+              <w:t>Dead-weight axial load per VVGS ≈ 10 MN; even with low-friction hinges the toroidal breakaway is ≈ 1 MN per support (≈ 5.7 MN for the whole vessel) — roughly 1000× the ≈ 4 kN gravitational restoring. Gravity cannot recentre the vessel: once a disruption/VDE load slides it, it stays, and over many events it ratchets within the polytope. The relevant n = 1 envelope is the polytope width ≈ 3.1 mm (§9) — about half the 6 mm budget.</w:t>
               <w:br/>
+            </w:r>
+            <w:r>
+              <w:rPr>
+                <w:b/>
+                <w:sz w:val="20"/>
+              </w:rPr>
+              <w:t xml:space="preserve">• Thermal cycling does not recentre it (§11). </w:t>
             </w:r>
             <w:r>
               <w:rPr>
                 <w:b w:val="0"/>
                 <w:sz w:val="20"/>
               </w:rPr>
-              <w:t>• Start-up (0 → 3 MA in 10 s) is favourable. Passive vessel currents pull the wall toward the offset toroidal-field magnetic centre; any motion during the ramp reduces the n ≤ 4 first-wall–field misalignment.</w:t>
+              <w:t>Warming to 100 °C grows the vessel radially ~12 mm (freely accommodated), but the off-centre toroidal demand is only ~µm — far too small to break the MN-scale stiction.</w:t>
               <w:br/>
+            </w:r>
+            <w:r>
+              <w:rPr>
+                <w:b/>
+                <w:sz w:val="20"/>
+              </w:rPr>
+              <w:t xml:space="preserve">• The statistics are only as good as the gap distribution (§12). </w:t>
             </w:r>
             <w:r>
               <w:rPr>
                 <w:b w:val="0"/>
                 <w:sz w:val="20"/>
               </w:rPr>
-              <w:t>• Disruption is the bounding VVGS lateral load case. An MN-scale lateral impulse over ms gives ~12 mm/s impact velocity at the dowel stops and ~1 MN peak lateral force on the VVGS — much larger than steady operation.</w:t>
-              <w:br/>
-            </w:r>
-            <w:r>
-              <w:rPr>
-                <w:b w:val="0"/>
-                <w:sz w:val="20"/>
-              </w:rPr>
-              <w:t>• Gap measurements tighten the bound. Each measured u_i pulls the displacement polytope toward the centre; with all 9 measured and near-centred the bound collapses to the 1.55 mm nominal envelope.</w:t>
+              <w:t>The Uniform(±1.5 mm) prior is not validated, so the MC percentiles are illustrative. The robust results are the distribution-free bounds and the force comparison. Measuring the nine gaps with feeler gauges collapses the problem to a deterministic calculation and is the recommended path.</w:t>
             </w:r>
           </w:p>
         </w:tc>
@@ -179,7 +193,7 @@
           <w:b w:val="0"/>
           <w:sz w:val="21"/>
         </w:rPr>
-        <w:t xml:space="preserve"> equally spaced toroidally beneath the lower ports, on a ring of radius R_s ≈ 8 m. Each VVGS is a </w:t>
+        <w:t xml:space="preserve"> equally spaced toroidally beneath the lower ports, on a ring of radius R_s ≈ 10 m. Each VVGS is a </w:t>
       </w:r>
       <w:r>
         <w:rPr>
@@ -406,7 +420,7 @@
               <w:rPr>
                 <w:sz w:val="20"/>
               </w:rPr>
-              <w:t>8 m</w:t>
+              <w:t>≈ 10 m</w:t>
             </w:r>
           </w:p>
         </w:tc>
@@ -428,6 +442,7 @@
               <w:rPr>
                 <w:sz w:val="20"/>
               </w:rPr>
+              <w:t>ITER_D_6TLUDY (VV Load Spec)</w:t>
             </w:r>
           </w:p>
         </w:tc>
@@ -612,7 +627,7 @@
               <w:rPr>
                 <w:sz w:val="20"/>
               </w:rPr>
-              <w:t>≈ 8000 t</w:t>
+              <w:t>≈ 9000 t</w:t>
             </w:r>
           </w:p>
         </w:tc>
@@ -634,7 +649,7 @@
               <w:rPr>
                 <w:sz w:val="20"/>
               </w:rPr>
-              <w:t>VV + in-vessel components</w:t>
+              <w:t>VV + in-vessel (ITER_D_6TLUDY)</w:t>
             </w:r>
           </w:p>
         </w:tc>
@@ -721,7 +736,7 @@
           <w:b w:val="0"/>
           <w:sz w:val="21"/>
         </w:rPr>
-        <w:t xml:space="preserve">We model the as-built state with the conservative prior that each support's pin offset u_i is </w:t>
+        <w:t xml:space="preserve">For the Monte-Carlo sections (§5–§6) we adopt the prior that each support's pin offset u_i is </w:t>
       </w:r>
       <w:r>
         <w:rPr>
@@ -746,10 +761,17 @@
       </w:r>
       <w:r>
         <w:rPr>
+          <w:b/>
+          <w:sz w:val="21"/>
+        </w:rPr>
+        <w:t>. This prior is not validated</w:t>
+      </w:r>
+      <w:r>
+        <w:rPr>
           <w:b w:val="0"/>
           <w:sz w:val="21"/>
         </w:rPr>
-        <w:t>. This is the prior used in the Monte Carlo of §5. (Shimming a support fixes its u_i to a measured value and removes that support's contribution to the mobility — see §6.)</w:t>
+        <w:t xml:space="preserve"> — neither the uniform shape nor the ±1.5 mm range is established (§12) — so the resulting percentiles are illustrative, and the load-bearing conclusions of this report are deliberately the distribution-free ones (the kinematic bounds and the force comparison). Shimming a support fixes its u_i to a measured value and removes that support's contribution to the mobility (§6).</w:t>
       </w:r>
     </w:p>
     <w:p>
@@ -788,7 +810,7 @@
           <w:b w:val="0"/>
           <w:sz w:val="21"/>
         </w:rPr>
-        <w:t xml:space="preserve"> — and the lateral plane has a parabolic potential well centred on the nominal position. The effective pendulum length is L_eff ≈ R_s / tan(15°) − z_CoG ≈ 26 m (sensitive to angle: ~2 m per degree).</w:t>
+        <w:t xml:space="preserve"> — and the lateral plane has a parabolic potential well centred on the nominal position. The effective pendulum length is L_eff ≈ R_s / tan(15°) − z_CoG ≈ 32 m (≈ 26–32 m over the estimated z_CoG = 5–10 m range).</w:t>
       </w:r>
     </w:p>
     <w:tbl>
@@ -893,7 +915,7 @@
               <w:rPr>
                 <w:sz w:val="20"/>
               </w:rPr>
-              <w:t>K ≈ 3.0 kN / mm</w:t>
+              <w:t>K ≈ 2.7 kN / mm</w:t>
             </w:r>
           </w:p>
         </w:tc>
@@ -940,7 +962,7 @@
               <w:rPr>
                 <w:sz w:val="20"/>
               </w:rPr>
-              <w:t>T_n ≈ 10 s   (f ≈ 0.1 Hz)</w:t>
+              <w:t>T_n ≈ 11 s   (f ≈ 0.09 Hz)</w:t>
             </w:r>
           </w:p>
         </w:tc>
@@ -965,7 +987,7 @@
                 <w:b/>
                 <w:sz w:val="20"/>
               </w:rPr>
-              <w:t>Force to push the vessel to a ±1.5 mm stop</w:t>
+              <w:t>Gravitational force to push the vessel to a ±1.5 mm stop</w:t>
             </w:r>
           </w:p>
         </w:tc>
@@ -987,7 +1009,7 @@
               <w:rPr>
                 <w:sz w:val="20"/>
               </w:rPr>
-              <w:t>F_stop ≈ 4.5 kN</w:t>
+              <w:t>F_stop ≈ 4.1 kN</w:t>
             </w:r>
           </w:p>
         </w:tc>
@@ -1012,7 +1034,7 @@
                 <w:b/>
                 <w:sz w:val="20"/>
               </w:rPr>
-              <w:t>Rest position with no lateral force</w:t>
+              <w:t>Rest position with no lateral force (frictionless)</w:t>
             </w:r>
           </w:p>
         </w:tc>
@@ -1077,14 +1099,14 @@
                 <w:b/>
                 <w:color w:val="2255AA"/>
               </w:rPr>
-              <w:t xml:space="preserve">Consequence.  </w:t>
+              <w:t xml:space="preserve">Consequence — in the frictionless idealisation.  </w:t>
             </w:r>
             <w:r>
               <w:rPr>
                 <w:b w:val="0"/>
                 <w:sz w:val="20"/>
               </w:rPr>
-              <w:t>Without an applied lateral force the vessel sits at the gravitational centre, regardless of the assembly offsets. The pins simply occupy their respective u_i positions in the slots; the vessel itself is on-axis.</w:t>
+              <w:t>With no friction, and no applied lateral force, the vessel would sit at the gravitational centre regardless of the assembly offsets — this is the lower-bound picture of §3–§6. §10 shows that dead-weight friction at the supports is ~1000× the centring force, so in reality the vessel does not return to centre once displaced; it holds its last position. Both bounds are carried through this report.</w:t>
             </w:r>
           </w:p>
         </w:tc>
@@ -1094,6 +1116,59 @@
       <w:pPr>
         <w:spacing w:after="40"/>
       </w:pPr>
+    </w:p>
+    <w:p>
+      <w:pPr>
+        <w:jc w:val="center"/>
+      </w:pPr>
+      <w:r>
+        <w:drawing>
+          <wp:inline xmlns:a="http://schemas.openxmlformats.org/drawingml/2006/main" xmlns:pic="http://schemas.openxmlformats.org/drawingml/2006/picture">
+            <wp:extent cx="3291840" cy="4420471"/>
+            <wp:docPr id="1" name="Picture 1"/>
+            <wp:cNvGraphicFramePr>
+              <a:graphicFrameLocks noChangeAspect="1"/>
+            </wp:cNvGraphicFramePr>
+            <a:graphic>
+              <a:graphicData uri="http://schemas.openxmlformats.org/drawingml/2006/picture">
+                <pic:pic>
+                  <pic:nvPicPr>
+                    <pic:cNvPr id="0" name="D_rocking_pendulum.gif"/>
+                    <pic:cNvPicPr/>
+                  </pic:nvPicPr>
+                  <pic:blipFill>
+                    <a:blip r:embed="rId9"/>
+                    <a:stretch>
+                      <a:fillRect/>
+                    </a:stretch>
+                  </pic:blipFill>
+                  <pic:spPr>
+                    <a:xfrm>
+                      <a:off x="0" y="0"/>
+                      <a:ext cx="3291840" cy="4420471"/>
+                    </a:xfrm>
+                    <a:prstGeom prst="rect"/>
+                  </pic:spPr>
+                </pic:pic>
+              </a:graphicData>
+            </a:graphic>
+          </wp:inline>
+        </w:drawing>
+      </w:r>
+    </w:p>
+    <w:p>
+      <w:pPr>
+        <w:spacing w:after="160"/>
+        <w:jc w:val="center"/>
+      </w:pPr>
+      <w:r>
+        <w:rPr>
+          <w:i/>
+          <w:color w:val="555555"/>
+          <w:sz w:val="17"/>
+        </w:rPr>
+        <w:t>The mechanism, side-on. Each VVGS is its actual 15° inclined dual-hinge (parallelogram) 4-bar; extended, the strut axes converge at the virtual pivot P, and the rigid vessel rocks about P as a soft gravitational pendulum (lateral sway exaggerated ~×400). This restoring mechanism is ~1000× too weak to overcome the supports' dead-weight stiction (§10).</w:t>
+      </w:r>
     </w:p>
     <w:p>
       <w:pPr>
@@ -1134,7 +1209,7 @@
           <w:b w:val="0"/>
           <w:sz w:val="21"/>
         </w:rPr>
-        <w:t>). Each of the nine supports imposes a single linear inequality constraint: the toroidal slide of the vessel relative to its dowel must stay within the ±1.5 mm slot. For support i at toroidal angle φ_i = π/2 − 2πi/9 on the support ring at radius R = 8 m, the slide is</w:t>
+        <w:t>). Each of the nine supports imposes a single linear inequality constraint: the toroidal slide of the vessel relative to its dowel must stay within the ±1.5 mm slot. For support i at toroidal angle φ_i = π/2 − 2πi/9 on the support ring at radius R = 10 m, the slide is</w:t>
       </w:r>
     </w:p>
     <w:p>
@@ -1183,7 +1258,7 @@
           <w:b/>
           <w:sz w:val="21"/>
         </w:rPr>
-        <w:t>AᵀA = diag(4.5, 4.5, 576)</w:t>
+        <w:t>AᵀA = diag(4.5, 4.5, 900)</w:t>
       </w:r>
       <w:r>
         <w:rPr>
@@ -1344,7 +1419,7 @@
         <w:drawing>
           <wp:inline xmlns:a="http://schemas.openxmlformats.org/drawingml/2006/main" xmlns:pic="http://schemas.openxmlformats.org/drawingml/2006/picture">
             <wp:extent cx="5852160" cy="3144516"/>
-            <wp:docPr id="1" name="Picture 1"/>
+            <wp:docPr id="2" name="Picture 2"/>
             <wp:cNvGraphicFramePr>
               <a:graphicFrameLocks noChangeAspect="1"/>
             </wp:cNvGraphicFramePr>
@@ -1356,7 +1431,7 @@
                     <pic:cNvPicPr/>
                   </pic:nvPicPr>
                   <pic:blipFill>
-                    <a:blip r:embed="rId9"/>
+                    <a:blip r:embed="rId10"/>
                     <a:stretch>
                       <a:fillRect/>
                     </a:stretch>
@@ -1446,7 +1521,7 @@
               <w:drawing>
                 <wp:inline xmlns:a="http://schemas.openxmlformats.org/drawingml/2006/main" xmlns:pic="http://schemas.openxmlformats.org/drawingml/2006/picture">
                   <wp:extent cx="2743200" cy="2743200"/>
-                  <wp:docPr id="2" name="Picture 2"/>
+                  <wp:docPr id="3" name="Picture 3"/>
                   <wp:cNvGraphicFramePr>
                     <a:graphicFrameLocks noChangeAspect="1"/>
                   </wp:cNvGraphicFramePr>
@@ -1458,7 +1533,7 @@
                           <pic:cNvPicPr/>
                         </pic:nvPicPr>
                         <pic:blipFill>
-                          <a:blip r:embed="rId10"/>
+                          <a:blip r:embed="rId11"/>
                           <a:stretch>
                             <a:fillRect/>
                           </a:stretch>
@@ -1520,7 +1595,7 @@
               <w:drawing>
                 <wp:inline xmlns:a="http://schemas.openxmlformats.org/drawingml/2006/main" xmlns:pic="http://schemas.openxmlformats.org/drawingml/2006/picture">
                   <wp:extent cx="2743200" cy="2743200"/>
-                  <wp:docPr id="3" name="Picture 3"/>
+                  <wp:docPr id="4" name="Picture 4"/>
                   <wp:cNvGraphicFramePr>
                     <a:graphicFrameLocks noChangeAspect="1"/>
                   </wp:cNvGraphicFramePr>
@@ -1532,7 +1607,7 @@
                           <pic:cNvPicPr/>
                         </pic:nvPicPr>
                         <pic:blipFill>
-                          <a:blip r:embed="rId11"/>
+                          <a:blip r:embed="rId12"/>
                           <a:stretch>
                             <a:fillRect/>
                           </a:stretch>
@@ -1619,7 +1694,7 @@
         <w:drawing>
           <wp:inline xmlns:a="http://schemas.openxmlformats.org/drawingml/2006/main" xmlns:pic="http://schemas.openxmlformats.org/drawingml/2006/picture">
             <wp:extent cx="5852160" cy="2345472"/>
-            <wp:docPr id="4" name="Picture 4"/>
+            <wp:docPr id="5" name="Picture 5"/>
             <wp:cNvGraphicFramePr>
               <a:graphicFrameLocks noChangeAspect="1"/>
             </wp:cNvGraphicFramePr>
@@ -1631,7 +1706,7 @@
                     <pic:cNvPicPr/>
                   </pic:nvPicPr>
                   <pic:blipFill>
-                    <a:blip r:embed="rId12"/>
+                    <a:blip r:embed="rId13"/>
                     <a:stretch>
                       <a:fillRect/>
                     </a:stretch>
@@ -2072,14 +2147,14 @@
         <w:tc>
           <w:tcPr>
             <w:tcW w:type="dxa" w:w="8640"/>
-            <w:shd w:val="clear" w:fill="e8efff"/>
+            <w:shd w:val="clear" w:fill="fff8e0"/>
             <w:tcBorders>
-              <w:left w:val="single" w:sz="24" w:color="2255aa"/>
+              <w:left w:val="single" w:sz="24" w:color="cc8800"/>
             </w:tcBorders>
             <w:tcBorders>
-              <w:top w:val="single" w:sz="4" w:color="e8efff"/>
-              <w:bottom w:val="single" w:sz="4" w:color="e8efff"/>
-              <w:right w:val="single" w:sz="4" w:color="e8efff"/>
+              <w:top w:val="single" w:sz="4" w:color="fff8e0"/>
+              <w:bottom w:val="single" w:sz="4" w:color="fff8e0"/>
+              <w:right w:val="single" w:sz="4" w:color="fff8e0"/>
             </w:tcBorders>
           </w:tcPr>
           <w:p>
@@ -2088,10 +2163,17 @@
             </w:pPr>
             <w:r>
               <w:rPr>
+                <w:b/>
+                <w:color w:val="CC8800"/>
+              </w:rPr>
+              <w:t xml:space="preserve">Reliability caveat — read the percentiles with caution.  </w:t>
+            </w:r>
+            <w:r>
+              <w:rPr>
                 <w:b w:val="0"/>
                 <w:sz w:val="20"/>
               </w:rPr>
-              <w:t>Quiescent (no lateral force) the vessel sits at the gravitational centre and contributes zero to the n = 1 first-wall shift. Under sufficient applied force the vessel can be displaced up to the polytope boundary; the MC quantifies that kinematic ceiling over the assembly distribution.</w:t>
+              <w:t>The Monte-Carlo percentiles above are only as trustworthy as the assumed input distribution. We drew each support offset from Uniform(−1.5 mm, +1.5 mm) independently, but neither the uniform shape nor the ±1.5 mm range is validated — the as-built gaps are set by assembly history, not by a known random process. The P95/P99 figures therefore carry low confidence and are illustrative. What does not depend on the distribution are (i) the nominal centred envelope (1.55 mm), (ii) the polytope-width ceiling (§9), and (iii) the stiction-vs-centring force comparison (§10). The recommendation (§12) is to measure the nine gaps with feeler gauges rather than propagate an unvalidated prior.</w:t>
             </w:r>
           </w:p>
         </w:tc>
@@ -2152,7 +2234,7 @@
         <w:drawing>
           <wp:inline xmlns:a="http://schemas.openxmlformats.org/drawingml/2006/main" xmlns:pic="http://schemas.openxmlformats.org/drawingml/2006/picture">
             <wp:extent cx="5852160" cy="2316925"/>
-            <wp:docPr id="5" name="Picture 5"/>
+            <wp:docPr id="6" name="Picture 6"/>
             <wp:cNvGraphicFramePr>
               <a:graphicFrameLocks noChangeAspect="1"/>
             </wp:cNvGraphicFramePr>
@@ -2164,7 +2246,7 @@
                     <pic:cNvPicPr/>
                   </pic:nvPicPr>
                   <pic:blipFill>
-                    <a:blip r:embed="rId13"/>
+                    <a:blip r:embed="rId14"/>
                     <a:stretch>
                       <a:fillRect/>
                     </a:stretch>
@@ -2789,7 +2871,7 @@
           <w:b w:val="0"/>
           <w:sz w:val="21"/>
         </w:rPr>
-        <w:t xml:space="preserve"> — comparable to the F_stop ≈ 4.5 kN centring threshold. The ramp duration (10 s) is comparable to the pendulum natural period (T_n ≈ 10 s), so the dynamic response factor for a single (non-periodic) ramp is ~1.3–1.5; the quasi-static deflection F/K = 0.3–3 mm becomes a peak transient excursion of order </w:t>
+        <w:t xml:space="preserve">. This is comparable to the gravitational centring threshold F_stop ≈ 4.1 kN but is far below the ≈ 1 MN per-support toroidal breakaway force (§10): a kN-scale start-up force does not slide the supports at all. The ramp duration (10 s) is comparable to the pendulum natural period (T_n ≈ 11 s), so in the frictionless idealisation the quasi-static deflection F/K = 0.4–4 mm would appear as a peak transient excursion of order </w:t>
       </w:r>
       <w:r>
         <w:rPr>
@@ -2803,7 +2885,7 @@
           <w:b w:val="0"/>
           <w:sz w:val="21"/>
         </w:rPr>
-        <w:t>. Combined with the favourable direction above, a defensible peak start-up wall–field n = 1 mismatch from this source is below the kinematic ceiling — a detailed EM transient is required to pin the precise value.</w:t>
+        <w:t xml:space="preserve"> in the favourable (self-aligning) direction. In the realistic stiction-dominated picture the start-up force is orders of magnitude below breakaway, so it produces no net lateral motion — it neither erodes nor relieves the budget kinematically. Either way this source is not budget-limiting; a detailed EM transient is required to pin the precise value.</w:t>
       </w:r>
     </w:p>
     <w:p>
@@ -2831,39 +2913,121 @@
           <w:b w:val="0"/>
           <w:sz w:val="21"/>
         </w:rPr>
-        <w:t xml:space="preserve">A current quench delivers an MN-scale lateral impulse to the vessel over ~10 ms — far faster than the 10 s vessel pendulum period and far larger than the kN-scale centring force. On this timescale the vessel responds essentially as a </w:t>
+        <w:t xml:space="preserve">Disruptions and asymmetric vertical displacement events (VDEs) deliver the large lateral loads. </w:t>
       </w:r>
       <w:r>
         <w:rPr>
           <w:b/>
           <w:sz w:val="21"/>
         </w:rPr>
-        <w:t>free mass</w:t>
+        <w:t>The bounding magnitudes and durations are defined in the ITER VV Load Specification (VVLS)</w:t>
       </w:r>
       <w:r>
         <w:rPr>
           <w:b w:val="0"/>
           <w:sz w:val="21"/>
         </w:rPr>
-        <w:t>:</w:t>
+        <w:t xml:space="preserve"> and are substantially larger than the illustrative impulse used in an earlier draft of this note; the values below are order-of-magnitude only and should be taken from the VVLS for design.</w:t>
+      </w:r>
+    </w:p>
+    <w:tbl>
+      <w:tblPr>
+        <w:tblW w:type="auto" w:w="0"/>
+        <w:jc w:val="center"/>
+        <w:tblLook w:firstColumn="1" w:firstRow="1" w:lastColumn="0" w:lastRow="0" w:noHBand="0" w:noVBand="1" w:val="04A0"/>
+      </w:tblPr>
+      <w:tblGrid>
+        <w:gridCol w:w="8640"/>
+      </w:tblGrid>
+      <w:tr>
+        <w:tc>
+          <w:tcPr>
+            <w:tcW w:type="dxa" w:w="8640"/>
+            <w:shd w:val="clear" w:fill="fff8e0"/>
+            <w:tcBorders>
+              <w:left w:val="single" w:sz="24" w:color="cc8800"/>
+            </w:tcBorders>
+            <w:tcBorders>
+              <w:top w:val="single" w:sz="4" w:color="fff8e0"/>
+              <w:bottom w:val="single" w:sz="4" w:color="fff8e0"/>
+              <w:right w:val="single" w:sz="4" w:color="fff8e0"/>
+            </w:tcBorders>
+          </w:tcPr>
+          <w:p>
+            <w:pPr>
+              <w:spacing w:before="0" w:after="40"/>
+            </w:pPr>
+            <w:r>
+              <w:rPr>
+                <w:b/>
+                <w:color w:val="CC8800"/>
+              </w:rPr>
+              <w:t xml:space="preserve">Correction.  </w:t>
+            </w:r>
+            <w:r>
+              <w:rPr>
+                <w:b w:val="0"/>
+                <w:sz w:val="20"/>
+              </w:rPr>
+              <w:t>An earlier version quoted a lateral impulse J ~ 10⁵ N·s over ~10 ms (free-mass velocity ~12 mm/s). Both the magnitude and the duration are lower than the VVLS bounding values, so the resulting toroidal VVGS force was correspondingly under-stated. The VVLS net horizontal VV loads are of order MN to tens of MN.</w:t>
+            </w:r>
+          </w:p>
+        </w:tc>
+      </w:tr>
+    </w:tbl>
+    <w:p>
+      <w:pPr>
+        <w:spacing w:after="40"/>
+      </w:pPr>
+    </w:p>
+    <w:p>
+      <w:pPr>
+        <w:spacing w:after="120"/>
+      </w:pPr>
+      <w:r>
+        <w:rPr>
+          <w:b w:val="0"/>
+          <w:sz w:val="21"/>
+        </w:rPr>
+        <w:t>Two regimes follow from the friction analysis (§10), with breakaway ≈ 5.7 MN aggregate (≈ 1 MN per support):</w:t>
       </w:r>
     </w:p>
     <w:p>
       <w:pPr>
         <w:spacing w:after="120"/>
-        <w:ind w:left="360"/>
       </w:pPr>
       <w:r>
         <w:rPr>
-          <w:rFonts w:ascii="Consolas" w:hAnsi="Consolas"/>
-          <w:color w:val="333333"/>
-          <w:sz w:val="19"/>
+          <w:b/>
+          <w:sz w:val="21"/>
         </w:rPr>
-        <w:t xml:space="preserve">  impulse   J = ∫F dt   ~  (10 MN)·(10 ms)        ≈  10⁵ N·s</w:t>
-        <w:br/>
-        <w:t xml:space="preserve">  velocity  v = J / M  ~  10⁵ / 8×10⁶ kg          ≈  12  mm/s</w:t>
-        <w:br/>
-        <w:t xml:space="preserve">  amplitude (free)  A = v / ω  ~  v·Tₙ / 2π         ≈  20 mm   (≫ 1.5 mm gap)</w:t>
+        <w:t xml:space="preserve">• Small / illustrative impulse (below breakaway). </w:t>
+      </w:r>
+      <w:r>
+        <w:rPr>
+          <w:b w:val="0"/>
+          <w:sz w:val="21"/>
+        </w:rPr>
+        <w:t>The earlier J ~ 10⁵ N·s carries kinetic energy ½Mv² ≈ 0.56 kJ (M ≈ 9000 t). The friction work over a full 3 mm slide is ≈ 5.7 MN × 3 mm ≈ 17 kJ ≫ 0.56 kJ, so such an impulse would move the vessel only ~0.1 mm before stiction arrests it — there is no free-flight impact on the stops, contrary to the earlier free-mass picture.</w:t>
+      </w:r>
+    </w:p>
+    <w:p>
+      <w:pPr>
+        <w:spacing w:after="120"/>
+      </w:pPr>
+      <w:r>
+        <w:rPr>
+          <w:b/>
+          <w:sz w:val="21"/>
+        </w:rPr>
+        <w:t xml:space="preserve">• VVLS bounding loads (above breakaway). </w:t>
+      </w:r>
+      <w:r>
+        <w:rPr>
+          <w:b w:val="0"/>
+          <w:sz w:val="21"/>
+        </w:rPr>
+        <w:t>Net horizontal loads of MN-to-tens-of-MN exceed the ≈ 5.7 MN breakaway, so the vessel does slide during major events. Each event displaces it by an amount set by the load, the impulse and the remaining slot; the displacement is retained (gravity cannot pull it back, §10). Repeated events make the vessel ratchet within the polytope (§9–§10).</w:t>
       </w:r>
     </w:p>
     <w:tbl>
@@ -2898,56 +3062,14 @@
                 <w:b/>
                 <w:color w:val="CC2200"/>
               </w:rPr>
-              <w:t xml:space="preserve">The vessel impacts the dowel stops at ~12 mm/s with ~0.5 kJ of kinetic energy.  </w:t>
+              <w:t xml:space="preserve">The disruption/VDE toroidal force is the bounding VVGS lateral load case  </w:t>
             </w:r>
             <w:r>
               <w:rPr>
                 <w:b w:val="0"/>
                 <w:sz w:val="20"/>
               </w:rPr>
-              <w:t xml:space="preserve">For a rigid stop the peak lateral force on the VVGS is on the order of </w:t>
-            </w:r>
-            <w:r>
-              <w:rPr>
-                <w:b/>
-                <w:sz w:val="20"/>
-              </w:rPr>
-              <w:t>~1 MN</w:t>
-            </w:r>
-            <w:r>
-              <w:rPr>
-                <w:b w:val="0"/>
-                <w:sz w:val="20"/>
-              </w:rPr>
-              <w:t xml:space="preserve"> — much larger than the steady gravity-related lateral demand on the support. This is an </w:t>
-            </w:r>
-            <w:r>
-              <w:rPr>
-                <w:b/>
-                <w:sz w:val="20"/>
-              </w:rPr>
-              <w:t>impulsive load case for the VVGS lateral capacity</w:t>
-            </w:r>
-            <w:r>
-              <w:rPr>
-                <w:b w:val="0"/>
-                <w:sz w:val="20"/>
-              </w:rPr>
-              <w:t xml:space="preserve">, distinct from steady operation, and is potentially the </w:t>
-            </w:r>
-            <w:r>
-              <w:rPr>
-                <w:b/>
-                <w:sz w:val="20"/>
-              </w:rPr>
-              <w:t>bounding load case for VVGS lateral design</w:t>
-            </w:r>
-            <w:r>
-              <w:rPr>
-                <w:b w:val="0"/>
-                <w:sz w:val="20"/>
-              </w:rPr>
-              <w:t>. The soft (kN-scale) centring provides essentially no deceleration before impact.</w:t>
+              <w:t>— and it is the mechanism that drives the vessel away from the gravitational centre toward the polytope-width bound. Its magnitude must be read from the VVLS; the analysis here establishes the consequence (irreversible walk), not the load value.</w:t>
             </w:r>
           </w:p>
         </w:tc>
@@ -2971,7 +3093,1476 @@
           <w:color w:val="2B5797"/>
           <w:sz w:val="28"/>
         </w:rPr>
-        <w:t>9 — The 6 mm n ≤ 4 First-Wall Budget</w:t>
+        <w:t>9 — Maximum Rattle: the Polytope-Width Bound</w:t>
+      </w:r>
+    </w:p>
+    <w:p>
+      <w:pPr>
+        <w:spacing w:after="120"/>
+      </w:pPr>
+      <w:r>
+        <w:rPr>
+          <w:b w:val="0"/>
+          <w:sz w:val="21"/>
+        </w:rPr>
+        <w:t xml:space="preserve">§3–§6 measured the departure from the gravitational centre — the right metric if the vessel self-centres. This section measures the complementary quantity: the </w:t>
+      </w:r>
+      <w:r>
+        <w:rPr>
+          <w:b/>
+          <w:sz w:val="21"/>
+        </w:rPr>
+        <w:t>full peak-to-peak width of the displacement polytope</w:t>
+      </w:r>
+      <w:r>
+        <w:rPr>
+          <w:b w:val="0"/>
+          <w:sz w:val="21"/>
+        </w:rPr>
+        <w:t xml:space="preserve"> (its diameter along the worst direction). The width is the total lateral travel available to the vessel — the kinematic ceiling on how far it can walk if friction (not gravity) sets its rest position (§10).</w:t>
+      </w:r>
+    </w:p>
+    <w:tbl>
+      <w:tblPr>
+        <w:tblW w:type="auto" w:w="0"/>
+        <w:jc w:val="center"/>
+        <w:tblLook w:firstColumn="1" w:firstRow="1" w:lastColumn="0" w:lastRow="0" w:noHBand="0" w:noVBand="1" w:val="04A0"/>
+      </w:tblPr>
+      <w:tblGrid>
+        <w:gridCol w:w="8640"/>
+      </w:tblGrid>
+      <w:tr>
+        <w:tc>
+          <w:tcPr>
+            <w:tcW w:type="dxa" w:w="8640"/>
+            <w:shd w:val="clear" w:fill="e8efff"/>
+            <w:tcBorders>
+              <w:left w:val="single" w:sz="24" w:color="2255aa"/>
+            </w:tcBorders>
+            <w:tcBorders>
+              <w:top w:val="single" w:sz="4" w:color="e8efff"/>
+              <w:bottom w:val="single" w:sz="4" w:color="e8efff"/>
+              <w:right w:val="single" w:sz="4" w:color="e8efff"/>
+            </w:tcBorders>
+          </w:tcPr>
+          <w:p>
+            <w:pPr>
+              <w:spacing w:before="0" w:after="40"/>
+            </w:pPr>
+            <w:r>
+              <w:rPr>
+                <w:b/>
+                <w:color w:val="2255AA"/>
+              </w:rPr>
+              <w:t xml:space="preserve">Width and departure behave oppositely.  </w:t>
+            </w:r>
+            <w:r>
+              <w:rPr>
+                <w:b w:val="0"/>
+                <w:sz w:val="20"/>
+              </w:rPr>
+              <w:t>Departure-from-centre is minimised at the centred assembly (u = 0 → 1.55 mm) and grows for offset assemblies. The polytope width is maximised at the centred assembly and shrinks for offset assemblies, so the worst-case width is the nominal one. Nominal width = 3.09 mm (distribution-free ceiling); over the assembly population: median 2.24 mm, P5 1.19 mm, minimum 0.21 mm — a typical as-built assembly has a narrower reachable envelope than nominal.</w:t>
+            </w:r>
+          </w:p>
+        </w:tc>
+      </w:tr>
+    </w:tbl>
+    <w:p>
+      <w:pPr>
+        <w:spacing w:after="40"/>
+      </w:pPr>
+    </w:p>
+    <w:p>
+      <w:pPr>
+        <w:jc w:val="center"/>
+      </w:pPr>
+      <w:r>
+        <w:drawing>
+          <wp:inline xmlns:a="http://schemas.openxmlformats.org/drawingml/2006/main" xmlns:pic="http://schemas.openxmlformats.org/drawingml/2006/picture">
+            <wp:extent cx="5852160" cy="2198339"/>
+            <wp:docPr id="7" name="Picture 7"/>
+            <wp:cNvGraphicFramePr>
+              <a:graphicFrameLocks noChangeAspect="1"/>
+            </wp:cNvGraphicFramePr>
+            <a:graphic>
+              <a:graphicData uri="http://schemas.openxmlformats.org/drawingml/2006/picture">
+                <pic:pic>
+                  <pic:nvPicPr>
+                    <pic:cNvPr id="0" name="rattle_dashboard.png"/>
+                    <pic:cNvPicPr/>
+                  </pic:nvPicPr>
+                  <pic:blipFill>
+                    <a:blip r:embed="rId15"/>
+                    <a:stretch>
+                      <a:fillRect/>
+                    </a:stretch>
+                  </pic:blipFill>
+                  <pic:spPr>
+                    <a:xfrm>
+                      <a:off x="0" y="0"/>
+                      <a:ext cx="5852160" cy="2198339"/>
+                    </a:xfrm>
+                    <a:prstGeom prst="rect"/>
+                  </pic:spPr>
+                </pic:pic>
+              </a:graphicData>
+            </a:graphic>
+          </wp:inline>
+        </w:drawing>
+      </w:r>
+    </w:p>
+    <w:p>
+      <w:pPr>
+        <w:spacing w:after="160"/>
+        <w:jc w:val="center"/>
+      </w:pPr>
+      <w:r>
+        <w:rPr>
+          <w:i/>
+          <w:color w:val="555555"/>
+          <w:sz w:val="17"/>
+        </w:rPr>
+        <w:t>Distribution (left) and CDF (right) of the polytope width (peak-to-peak rattle) over 5000 assemblies. The nominal (u = 0) width 3.09 mm is the ceiling; offset assemblies are more constrained and sit below it. The shape inherits the unvalidated gap prior (§12), but the ceiling is distribution-free.</w:t>
+      </w:r>
+    </w:p>
+    <w:p>
+      <w:pPr>
+        <w:jc w:val="center"/>
+      </w:pPr>
+      <w:r>
+        <w:drawing>
+          <wp:inline xmlns:a="http://schemas.openxmlformats.org/drawingml/2006/main" xmlns:pic="http://schemas.openxmlformats.org/drawingml/2006/picture">
+            <wp:extent cx="3291840" cy="3291840"/>
+            <wp:docPr id="8" name="Picture 8"/>
+            <wp:cNvGraphicFramePr>
+              <a:graphicFrameLocks noChangeAspect="1"/>
+            </wp:cNvGraphicFramePr>
+            <a:graphic>
+              <a:graphicData uri="http://schemas.openxmlformats.org/drawingml/2006/picture">
+                <pic:pic>
+                  <pic:nvPicPr>
+                    <pic:cNvPr id="0" name="rattle_width_nominal.gif"/>
+                    <pic:cNvPicPr/>
+                  </pic:nvPicPr>
+                  <pic:blipFill>
+                    <a:blip r:embed="rId16"/>
+                    <a:stretch>
+                      <a:fillRect/>
+                    </a:stretch>
+                  </pic:blipFill>
+                  <pic:spPr>
+                    <a:xfrm>
+                      <a:off x="0" y="0"/>
+                      <a:ext cx="3291840" cy="3291840"/>
+                    </a:xfrm>
+                    <a:prstGeom prst="rect"/>
+                  </pic:spPr>
+                </pic:pic>
+              </a:graphicData>
+            </a:graphic>
+          </wp:inline>
+        </w:drawing>
+      </w:r>
+    </w:p>
+    <w:p>
+      <w:pPr>
+        <w:spacing w:after="160"/>
+        <w:jc w:val="center"/>
+      </w:pPr>
+      <w:r>
+        <w:rPr>
+          <w:i/>
+          <w:color w:val="555555"/>
+          <w:sz w:val="17"/>
+        </w:rPr>
+        <w:t>The nominal assembly swept across the full polytope width (×500). The VV centre travels the complete ±1.55 mm diameter; the coloured pins show the toroidal-slot usage (blue = slack, orange = near limit, red = at the ±1.5 mm stop).</w:t>
+      </w:r>
+    </w:p>
+    <w:p>
+      <w:pPr>
+        <w:spacing w:before="320" w:after="80"/>
+        <w:pBdr>
+          <w:bottom w:val="single" w:sz="6" w:space="2" w:color="2b5797"/>
+        </w:pBdr>
+      </w:pPr>
+      <w:r>
+        <w:rPr>
+          <w:b/>
+          <w:color w:val="2B5797"/>
+          <w:sz w:val="28"/>
+        </w:rPr>
+        <w:t>10 — Which Bound? Frictionless Self-Centring vs Stiction Walk</w:t>
+      </w:r>
+    </w:p>
+    <w:p>
+      <w:pPr>
+        <w:spacing w:after="120"/>
+      </w:pPr>
+      <w:r>
+        <w:rPr>
+          <w:b w:val="0"/>
+          <w:sz w:val="21"/>
+        </w:rPr>
+        <w:t>Which regime ITER occupies is decided by one comparison: the gravitational restoring force that would recentre the vessel, versus the friction (stiction) force that resists toroidal sliding at the supports.</w:t>
+      </w:r>
+    </w:p>
+    <w:tbl>
+      <w:tblPr>
+        <w:tblW w:type="auto" w:w="0"/>
+        <w:jc w:val="center"/>
+        <w:tblLook w:firstColumn="1" w:firstRow="1" w:lastColumn="0" w:lastRow="0" w:noHBand="0" w:noVBand="1" w:val="04A0"/>
+      </w:tblPr>
+      <w:tblGrid>
+        <w:gridCol w:w="2880"/>
+        <w:gridCol w:w="2880"/>
+        <w:gridCol w:w="2880"/>
+      </w:tblGrid>
+      <w:tr>
+        <w:tc>
+          <w:tcPr>
+            <w:tcW w:type="dxa" w:w="2880"/>
+            <w:tcBorders>
+              <w:top w:val="single" w:sz="8" w:color="888888"/>
+              <w:bottom w:val="single" w:sz="6" w:color="888888"/>
+              <w:left w:val="nil"/>
+              <w:right w:val="nil"/>
+            </w:tcBorders>
+          </w:tcPr>
+          <w:p>
+            <w:pPr>
+              <w:spacing w:before="0" w:after="40"/>
+            </w:pPr>
+            <w:r>
+              <w:rPr>
+                <w:b/>
+                <w:color w:val="1A3A6E"/>
+                <w:sz w:val="20"/>
+              </w:rPr>
+              <w:t>Quantity</w:t>
+            </w:r>
+          </w:p>
+        </w:tc>
+        <w:tc>
+          <w:tcPr>
+            <w:tcW w:type="dxa" w:w="2880"/>
+            <w:tcBorders>
+              <w:top w:val="single" w:sz="8" w:color="888888"/>
+              <w:bottom w:val="single" w:sz="6" w:color="888888"/>
+              <w:left w:val="nil"/>
+              <w:right w:val="nil"/>
+            </w:tcBorders>
+          </w:tcPr>
+          <w:p>
+            <w:pPr>
+              <w:spacing w:before="0" w:after="40"/>
+            </w:pPr>
+            <w:r>
+              <w:rPr>
+                <w:b/>
+                <w:color w:val="1A3A6E"/>
+                <w:sz w:val="20"/>
+              </w:rPr>
+              <w:t>Value</w:t>
+            </w:r>
+          </w:p>
+        </w:tc>
+        <w:tc>
+          <w:tcPr>
+            <w:tcW w:type="dxa" w:w="2880"/>
+            <w:tcBorders>
+              <w:top w:val="single" w:sz="8" w:color="888888"/>
+              <w:bottom w:val="single" w:sz="6" w:color="888888"/>
+              <w:left w:val="nil"/>
+              <w:right w:val="nil"/>
+            </w:tcBorders>
+          </w:tcPr>
+          <w:p>
+            <w:pPr>
+              <w:spacing w:before="0" w:after="40"/>
+            </w:pPr>
+            <w:r>
+              <w:rPr>
+                <w:b/>
+                <w:color w:val="1A3A6E"/>
+                <w:sz w:val="20"/>
+              </w:rPr>
+              <w:t>Basis</w:t>
+            </w:r>
+          </w:p>
+        </w:tc>
+      </w:tr>
+      <w:tr>
+        <w:tc>
+          <w:tcPr>
+            <w:tcW w:type="dxa" w:w="2880"/>
+            <w:tcBorders>
+              <w:top w:val="nil"/>
+              <w:bottom w:val="nil"/>
+              <w:left w:val="nil"/>
+              <w:right w:val="nil"/>
+            </w:tcBorders>
+          </w:tcPr>
+          <w:p>
+            <w:pPr>
+              <w:spacing w:before="0" w:after="40"/>
+            </w:pPr>
+            <w:r>
+              <w:rPr>
+                <w:b/>
+                <w:sz w:val="20"/>
+              </w:rPr>
+              <w:t>Dead-weight axial force per VVGS (15° strut)</w:t>
+            </w:r>
+          </w:p>
+        </w:tc>
+        <w:tc>
+          <w:tcPr>
+            <w:tcW w:type="dxa" w:w="2880"/>
+            <w:tcBorders>
+              <w:top w:val="nil"/>
+              <w:bottom w:val="nil"/>
+              <w:left w:val="nil"/>
+              <w:right w:val="nil"/>
+            </w:tcBorders>
+          </w:tcPr>
+          <w:p>
+            <w:pPr>
+              <w:spacing w:before="0" w:after="40"/>
+            </w:pPr>
+            <w:r>
+              <w:rPr>
+                <w:sz w:val="20"/>
+              </w:rPr>
+              <w:t>≈ 10.2 MN</w:t>
+            </w:r>
+          </w:p>
+        </w:tc>
+        <w:tc>
+          <w:tcPr>
+            <w:tcW w:type="dxa" w:w="2880"/>
+            <w:tcBorders>
+              <w:top w:val="nil"/>
+              <w:bottom w:val="nil"/>
+              <w:left w:val="nil"/>
+              <w:right w:val="nil"/>
+            </w:tcBorders>
+          </w:tcPr>
+          <w:p>
+            <w:pPr>
+              <w:spacing w:before="0" w:after="40"/>
+            </w:pPr>
+            <w:r>
+              <w:rPr>
+                <w:sz w:val="20"/>
+              </w:rPr>
+              <w:t>(Mg/9)/cos 15°, M ≈ 9000 t</w:t>
+            </w:r>
+          </w:p>
+        </w:tc>
+      </w:tr>
+      <w:tr>
+        <w:tc>
+          <w:tcPr>
+            <w:tcW w:type="dxa" w:w="2880"/>
+            <w:tcBorders>
+              <w:top w:val="nil"/>
+              <w:bottom w:val="nil"/>
+              <w:left w:val="nil"/>
+              <w:right w:val="nil"/>
+            </w:tcBorders>
+          </w:tcPr>
+          <w:p>
+            <w:pPr>
+              <w:spacing w:before="0" w:after="40"/>
+            </w:pPr>
+            <w:r>
+              <w:rPr>
+                <w:b/>
+                <w:sz w:val="20"/>
+              </w:rPr>
+              <w:t>Toroidal breakaway (stiction) per support</w:t>
+            </w:r>
+          </w:p>
+        </w:tc>
+        <w:tc>
+          <w:tcPr>
+            <w:tcW w:type="dxa" w:w="2880"/>
+            <w:tcBorders>
+              <w:top w:val="nil"/>
+              <w:bottom w:val="nil"/>
+              <w:left w:val="nil"/>
+              <w:right w:val="nil"/>
+            </w:tcBorders>
+          </w:tcPr>
+          <w:p>
+            <w:pPr>
+              <w:spacing w:before="0" w:after="40"/>
+            </w:pPr>
+            <w:r>
+              <w:rPr>
+                <w:sz w:val="20"/>
+              </w:rPr>
+              <w:t>≈ 1.0 MN</w:t>
+            </w:r>
+          </w:p>
+        </w:tc>
+        <w:tc>
+          <w:tcPr>
+            <w:tcW w:type="dxa" w:w="2880"/>
+            <w:tcBorders>
+              <w:top w:val="nil"/>
+              <w:bottom w:val="nil"/>
+              <w:left w:val="nil"/>
+              <w:right w:val="nil"/>
+            </w:tcBorders>
+          </w:tcPr>
+          <w:p>
+            <w:pPr>
+              <w:spacing w:before="0" w:after="40"/>
+            </w:pPr>
+            <w:r>
+              <w:rPr>
+                <w:sz w:val="20"/>
+              </w:rPr>
+              <w:t>μ ≈ 0.1 × axial</w:t>
+            </w:r>
+          </w:p>
+        </w:tc>
+      </w:tr>
+      <w:tr>
+        <w:tc>
+          <w:tcPr>
+            <w:tcW w:type="dxa" w:w="2880"/>
+            <w:tcBorders>
+              <w:top w:val="nil"/>
+              <w:bottom w:val="nil"/>
+              <w:left w:val="nil"/>
+              <w:right w:val="nil"/>
+            </w:tcBorders>
+          </w:tcPr>
+          <w:p>
+            <w:pPr>
+              <w:spacing w:before="0" w:after="40"/>
+            </w:pPr>
+            <w:r>
+              <w:rPr>
+                <w:b/>
+                <w:sz w:val="20"/>
+              </w:rPr>
+              <w:t>Aggregate lateral breakaway (all 9, worst dir.)</w:t>
+            </w:r>
+          </w:p>
+        </w:tc>
+        <w:tc>
+          <w:tcPr>
+            <w:tcW w:type="dxa" w:w="2880"/>
+            <w:tcBorders>
+              <w:top w:val="nil"/>
+              <w:bottom w:val="nil"/>
+              <w:left w:val="nil"/>
+              <w:right w:val="nil"/>
+            </w:tcBorders>
+          </w:tcPr>
+          <w:p>
+            <w:pPr>
+              <w:spacing w:before="0" w:after="40"/>
+            </w:pPr>
+            <w:r>
+              <w:rPr>
+                <w:sz w:val="20"/>
+              </w:rPr>
+              <w:t>≈ 5.7 MN</w:t>
+            </w:r>
+          </w:p>
+        </w:tc>
+        <w:tc>
+          <w:tcPr>
+            <w:tcW w:type="dxa" w:w="2880"/>
+            <w:tcBorders>
+              <w:top w:val="nil"/>
+              <w:bottom w:val="nil"/>
+              <w:left w:val="nil"/>
+              <w:right w:val="nil"/>
+            </w:tcBorders>
+          </w:tcPr>
+          <w:p>
+            <w:pPr>
+              <w:spacing w:before="0" w:after="40"/>
+            </w:pPr>
+            <w:r>
+              <w:rPr>
+                <w:sz w:val="20"/>
+              </w:rPr>
+              <w:t>Σ μN |sin(θ−φ_i)|</w:t>
+            </w:r>
+          </w:p>
+        </w:tc>
+      </w:tr>
+      <w:tr>
+        <w:tc>
+          <w:tcPr>
+            <w:tcW w:type="dxa" w:w="2880"/>
+            <w:tcBorders>
+              <w:top w:val="nil"/>
+              <w:bottom w:val="nil"/>
+              <w:left w:val="nil"/>
+              <w:right w:val="nil"/>
+            </w:tcBorders>
+          </w:tcPr>
+          <w:p>
+            <w:pPr>
+              <w:spacing w:before="0" w:after="40"/>
+            </w:pPr>
+            <w:r>
+              <w:rPr>
+                <w:b/>
+                <w:sz w:val="20"/>
+              </w:rPr>
+              <w:t>Gravitational restoring at the ±1.5 mm stop</w:t>
+            </w:r>
+          </w:p>
+        </w:tc>
+        <w:tc>
+          <w:tcPr>
+            <w:tcW w:type="dxa" w:w="2880"/>
+            <w:tcBorders>
+              <w:top w:val="nil"/>
+              <w:bottom w:val="nil"/>
+              <w:left w:val="nil"/>
+              <w:right w:val="nil"/>
+            </w:tcBorders>
+          </w:tcPr>
+          <w:p>
+            <w:pPr>
+              <w:spacing w:before="0" w:after="40"/>
+            </w:pPr>
+            <w:r>
+              <w:rPr>
+                <w:sz w:val="20"/>
+              </w:rPr>
+              <w:t>≈ 4.1 kN</w:t>
+            </w:r>
+          </w:p>
+        </w:tc>
+        <w:tc>
+          <w:tcPr>
+            <w:tcW w:type="dxa" w:w="2880"/>
+            <w:tcBorders>
+              <w:top w:val="nil"/>
+              <w:bottom w:val="nil"/>
+              <w:left w:val="nil"/>
+              <w:right w:val="nil"/>
+            </w:tcBorders>
+          </w:tcPr>
+          <w:p>
+            <w:pPr>
+              <w:spacing w:before="0" w:after="40"/>
+            </w:pPr>
+            <w:r>
+              <w:rPr>
+                <w:sz w:val="20"/>
+              </w:rPr>
+              <w:t>K × 1.5 mm</w:t>
+            </w:r>
+          </w:p>
+        </w:tc>
+      </w:tr>
+      <w:tr>
+        <w:tc>
+          <w:tcPr>
+            <w:tcW w:type="dxa" w:w="2880"/>
+            <w:tcBorders>
+              <w:top w:val="nil"/>
+              <w:bottom w:val="single" w:sz="8" w:color="888888"/>
+              <w:left w:val="nil"/>
+              <w:right w:val="nil"/>
+            </w:tcBorders>
+          </w:tcPr>
+          <w:p>
+            <w:pPr>
+              <w:spacing w:before="0" w:after="40"/>
+            </w:pPr>
+            <w:r>
+              <w:rPr>
+                <w:b/>
+                <w:sz w:val="20"/>
+              </w:rPr>
+              <w:t>Breakaway ÷ restoring</w:t>
+            </w:r>
+          </w:p>
+        </w:tc>
+        <w:tc>
+          <w:tcPr>
+            <w:tcW w:type="dxa" w:w="2880"/>
+            <w:tcBorders>
+              <w:top w:val="nil"/>
+              <w:bottom w:val="single" w:sz="8" w:color="888888"/>
+              <w:left w:val="nil"/>
+              <w:right w:val="nil"/>
+            </w:tcBorders>
+          </w:tcPr>
+          <w:p>
+            <w:pPr>
+              <w:spacing w:before="0" w:after="40"/>
+            </w:pPr>
+            <w:r>
+              <w:rPr>
+                <w:sz w:val="20"/>
+              </w:rPr>
+              <w:t>≈ 1400×</w:t>
+            </w:r>
+          </w:p>
+        </w:tc>
+        <w:tc>
+          <w:tcPr>
+            <w:tcW w:type="dxa" w:w="2880"/>
+            <w:tcBorders>
+              <w:top w:val="nil"/>
+              <w:bottom w:val="single" w:sz="8" w:color="888888"/>
+              <w:left w:val="nil"/>
+              <w:right w:val="nil"/>
+            </w:tcBorders>
+          </w:tcPr>
+          <w:p>
+            <w:pPr>
+              <w:spacing w:before="0" w:after="40"/>
+            </w:pPr>
+            <w:r>
+              <w:rPr>
+                <w:sz w:val="20"/>
+              </w:rPr>
+              <w:t>2–3 orders of magnitude</w:t>
+            </w:r>
+          </w:p>
+        </w:tc>
+      </w:tr>
+    </w:tbl>
+    <w:p>
+      <w:pPr>
+        <w:spacing w:after="80"/>
+      </w:pPr>
+    </w:p>
+    <w:tbl>
+      <w:tblPr>
+        <w:tblW w:type="auto" w:w="0"/>
+        <w:jc w:val="center"/>
+        <w:tblLook w:firstColumn="1" w:firstRow="1" w:lastColumn="0" w:lastRow="0" w:noHBand="0" w:noVBand="1" w:val="04A0"/>
+      </w:tblPr>
+      <w:tblGrid>
+        <w:gridCol w:w="8640"/>
+      </w:tblGrid>
+      <w:tr>
+        <w:tc>
+          <w:tcPr>
+            <w:tcW w:type="dxa" w:w="8640"/>
+            <w:shd w:val="clear" w:fill="fff0ee"/>
+            <w:tcBorders>
+              <w:left w:val="single" w:sz="24" w:color="cc2200"/>
+            </w:tcBorders>
+            <w:tcBorders>
+              <w:top w:val="single" w:sz="4" w:color="fff0ee"/>
+              <w:bottom w:val="single" w:sz="4" w:color="fff0ee"/>
+              <w:right w:val="single" w:sz="4" w:color="fff0ee"/>
+            </w:tcBorders>
+          </w:tcPr>
+          <w:p>
+            <w:pPr>
+              <w:spacing w:before="0" w:after="40"/>
+            </w:pPr>
+            <w:r>
+              <w:rPr>
+                <w:b/>
+                <w:color w:val="CC2200"/>
+              </w:rPr>
+              <w:t xml:space="preserve">Stiction wins by ~1000×.  </w:t>
+            </w:r>
+            <w:r>
+              <w:rPr>
+                <w:b w:val="0"/>
+                <w:sz w:val="20"/>
+              </w:rPr>
+              <w:t>The gravitational restoring force (kN) is negligible against the toroidal breakaway force (MN). The vessel does not self-centre. Once any load large enough to break stiction (a disruption/VDE, §8) slides the supports, the vessel moves and stays there — gravity cannot pull it back. Over many events the vessel ratchets / walks through the polytope. The frictionless self-centring picture of §3–§6 is a lower bound; the realistic operational envelope is the polytope width (§9), ≈ 3.1 mm at worst.</w:t>
+            </w:r>
+          </w:p>
+        </w:tc>
+      </w:tr>
+    </w:tbl>
+    <w:p>
+      <w:pPr>
+        <w:spacing w:after="40"/>
+      </w:pPr>
+    </w:p>
+    <w:p>
+      <w:pPr>
+        <w:jc w:val="center"/>
+      </w:pPr>
+      <w:r>
+        <w:drawing>
+          <wp:inline xmlns:a="http://schemas.openxmlformats.org/drawingml/2006/main" xmlns:pic="http://schemas.openxmlformats.org/drawingml/2006/picture">
+            <wp:extent cx="5852160" cy="2090057"/>
+            <wp:docPr id="9" name="Picture 9"/>
+            <wp:cNvGraphicFramePr>
+              <a:graphicFrameLocks noChangeAspect="1"/>
+            </wp:cNvGraphicFramePr>
+            <a:graphic>
+              <a:graphicData uri="http://schemas.openxmlformats.org/drawingml/2006/picture">
+                <pic:pic>
+                  <pic:nvPicPr>
+                    <pic:cNvPr id="0" name="two_bounds.png"/>
+                    <pic:cNvPicPr/>
+                  </pic:nvPicPr>
+                  <pic:blipFill>
+                    <a:blip r:embed="rId17"/>
+                    <a:stretch>
+                      <a:fillRect/>
+                    </a:stretch>
+                  </pic:blipFill>
+                  <pic:spPr>
+                    <a:xfrm>
+                      <a:off x="0" y="0"/>
+                      <a:ext cx="5852160" cy="2090057"/>
+                    </a:xfrm>
+                    <a:prstGeom prst="rect"/>
+                  </pic:spPr>
+                </pic:pic>
+              </a:graphicData>
+            </a:graphic>
+          </wp:inline>
+        </w:drawing>
+      </w:r>
+    </w:p>
+    <w:p>
+      <w:pPr>
+        <w:spacing w:after="160"/>
+        <w:jc w:val="center"/>
+      </w:pPr>
+      <w:r>
+        <w:rPr>
+          <w:i/>
+          <w:color w:val="555555"/>
+          <w:sz w:val="17"/>
+        </w:rPr>
+        <w:t>Left — the two metrics as distributions: departure-from-centre (blue, frictionless lower bound) and polytope width (red, stiction-walk envelope). Right — the VV n = 1 first-wall contribution under each regime against the 6 mm budget: frictionless self-centred ≈ 0, but the realistic stiction-walk ceiling ≈ 3.1 mm consumes about half the budget.</w:t>
+      </w:r>
+    </w:p>
+    <w:p>
+      <w:pPr>
+        <w:spacing w:before="320" w:after="80"/>
+        <w:pBdr>
+          <w:bottom w:val="single" w:sz="6" w:space="2" w:color="2b5797"/>
+        </w:pBdr>
+      </w:pPr>
+      <w:r>
+        <w:rPr>
+          <w:b/>
+          <w:color w:val="2B5797"/>
+          <w:sz w:val="28"/>
+        </w:rPr>
+        <w:t>11 — Thermal Cycling &amp; the Statically-Overdetermined Structure</w:t>
+      </w:r>
+    </w:p>
+    <w:p>
+      <w:pPr>
+        <w:spacing w:after="120"/>
+      </w:pPr>
+      <w:r>
+        <w:rPr>
+          <w:b w:val="0"/>
+          <w:sz w:val="21"/>
+        </w:rPr>
+        <w:t>Does warming the vessel relax the nine stictions in a coordinated way that lets it settle back to the gravitational centre? And what loads does an off-centre vessel generate when heated, given that nine supports over-constrain a body with only three in-plane freedoms?</w:t>
+      </w:r>
+    </w:p>
+    <w:p>
+      <w:pPr>
+        <w:spacing w:before="200" w:after="40"/>
+      </w:pPr>
+      <w:r>
+        <w:rPr>
+          <w:b/>
+          <w:color w:val="444444"/>
+          <w:sz w:val="23"/>
+        </w:rPr>
+        <w:t>Free radial breathing — large, but it does not recentre</w:t>
+      </w:r>
+    </w:p>
+    <w:p>
+      <w:pPr>
+        <w:spacing w:after="120"/>
+      </w:pPr>
+      <w:r>
+        <w:rPr>
+          <w:b w:val="0"/>
+          <w:sz w:val="21"/>
+        </w:rPr>
+        <w:t>For ΔT ≈ 78 K (22 → 100 °C) and 316L(N) α ≈ 16×10⁻⁶ K⁻¹, the support radius grows by R_s·α·ΔT ≈ 12.5 mm (≈ 32 mm at the full 200 °C bake). This is the motion the dual-hinge supports are designed to take: the dowels rotate, the radial growth is free, and no toroidal slot demand or lateral load is generated — provided the expansion is about the support-ring centre.</w:t>
+      </w:r>
+    </w:p>
+    <w:tbl>
+      <w:tblPr>
+        <w:tblW w:type="auto" w:w="0"/>
+        <w:jc w:val="center"/>
+        <w:tblLook w:firstColumn="1" w:firstRow="1" w:lastColumn="0" w:lastRow="0" w:noHBand="0" w:noVBand="1" w:val="04A0"/>
+      </w:tblPr>
+      <w:tblGrid>
+        <w:gridCol w:w="8640"/>
+      </w:tblGrid>
+      <w:tr>
+        <w:tc>
+          <w:tcPr>
+            <w:tcW w:type="dxa" w:w="8640"/>
+            <w:shd w:val="clear" w:fill="fff0ee"/>
+            <w:tcBorders>
+              <w:left w:val="single" w:sz="24" w:color="cc2200"/>
+            </w:tcBorders>
+            <w:tcBorders>
+              <w:top w:val="single" w:sz="4" w:color="fff0ee"/>
+              <w:bottom w:val="single" w:sz="4" w:color="fff0ee"/>
+              <w:right w:val="single" w:sz="4" w:color="fff0ee"/>
+            </w:tcBorders>
+          </w:tcPr>
+          <w:p>
+            <w:pPr>
+              <w:spacing w:before="0" w:after="40"/>
+            </w:pPr>
+            <w:r>
+              <w:rPr>
+                <w:b/>
+                <w:color w:val="CC2200"/>
+              </w:rPr>
+              <w:t xml:space="preserve">Thermal cycling does not break the stiction.  </w:t>
+            </w:r>
+            <w:r>
+              <w:rPr>
+                <w:b w:val="0"/>
+                <w:sz w:val="20"/>
+              </w:rPr>
+              <w:t>If the vessel is off-centre by d, isotropic expansion about its centroid produces a toroidal slot demand of only α·ΔT·|d| ≈ 3.7 µm (for d = 3 mm). The elastic force to absorb such a micron-scale mismatch at a locked slot is a few kN — ~1000× below the ≈ 1 MN stiction. Heating neither unloads the supports (weight, hence stiction, is temperature-independent) nor generates enough toroidal demand to slide them. An off-centre vessel stays off-centre through thermal cycles; there is no coordinated relaxation back to the gravitational centre.</w:t>
+            </w:r>
+          </w:p>
+        </w:tc>
+      </w:tr>
+    </w:tbl>
+    <w:p>
+      <w:pPr>
+        <w:spacing w:after="40"/>
+      </w:pPr>
+    </w:p>
+    <w:p>
+      <w:pPr>
+        <w:spacing w:before="200" w:after="40"/>
+      </w:pPr>
+      <w:r>
+        <w:rPr>
+          <w:b/>
+          <w:color w:val="444444"/>
+          <w:sz w:val="23"/>
+        </w:rPr>
+        <w:t>Locked-in loads: uniform expansion is benign; asymmetry is the risk</w:t>
+      </w:r>
+    </w:p>
+    <w:p>
+      <w:pPr>
+        <w:spacing w:after="120"/>
+      </w:pPr>
+      <w:r>
+        <w:rPr>
+          <w:b w:val="0"/>
+          <w:sz w:val="21"/>
+        </w:rPr>
+        <w:t>Uniform isotropic expansion of an off-centre vessel maps exactly onto a representable rigid-body shift, because δ_i^th = α·ΔT·(d·ê_t,i) = A[i,:]·(α·ΔT·d_x, α·ΔT·d_y, 0). A demand lying in the column space of A is a rigid-body mode and induces no self-stress (only the µm-scale take-up above if a slot is locked). So uniform heating of a nominally symmetric vessel is benign.</w:t>
+      </w:r>
+    </w:p>
+    <w:p>
+      <w:pPr>
+        <w:spacing w:after="120"/>
+      </w:pPr>
+      <w:r>
+        <w:rPr>
+          <w:b w:val="0"/>
+          <w:sz w:val="21"/>
+        </w:rPr>
+        <w:t>The genuine thermal risk is support-to-support asymmetry: non-uniform temperatures (sector gradients, asymmetric baking, local heating) produce a toroidal demand pattern that does not lie in the column space of A. That component cannot be relieved by any rigid-body motion, so in a statically over-determined ring it is carried as a self-equilibrating internal load set across the redundant supports — locked-in toroidal dowel forces scaling with the differential expansion (α·ΔT·ΔR_support-to-support), not with the mean temperature.</w:t>
+      </w:r>
+    </w:p>
+    <w:tbl>
+      <w:tblPr>
+        <w:tblW w:type="auto" w:w="0"/>
+        <w:jc w:val="center"/>
+        <w:tblLook w:firstColumn="1" w:firstRow="1" w:lastColumn="0" w:lastRow="0" w:noHBand="0" w:noVBand="1" w:val="04A0"/>
+      </w:tblPr>
+      <w:tblGrid>
+        <w:gridCol w:w="8640"/>
+      </w:tblGrid>
+      <w:tr>
+        <w:tc>
+          <w:tcPr>
+            <w:tcW w:type="dxa" w:w="8640"/>
+            <w:shd w:val="clear" w:fill="fff8e0"/>
+            <w:tcBorders>
+              <w:left w:val="single" w:sz="24" w:color="cc8800"/>
+            </w:tcBorders>
+            <w:tcBorders>
+              <w:top w:val="single" w:sz="4" w:color="fff8e0"/>
+              <w:bottom w:val="single" w:sz="4" w:color="fff8e0"/>
+              <w:right w:val="single" w:sz="4" w:color="fff8e0"/>
+            </w:tcBorders>
+          </w:tcPr>
+          <w:p>
+            <w:pPr>
+              <w:spacing w:before="0" w:after="40"/>
+            </w:pPr>
+            <w:r>
+              <w:rPr>
+                <w:b/>
+                <w:color w:val="CC8800"/>
+              </w:rPr>
+              <w:t xml:space="preserve">Conjecture (needs FE confirmation).  </w:t>
+            </w:r>
+            <w:r>
+              <w:rPr>
+                <w:b w:val="0"/>
+                <w:sz w:val="20"/>
+              </w:rPr>
+              <w:t>The dominant thermal lateral concern is not mean-temperature recentring (it does not happen) but the locked-in self-stress from asymmetric thermal fields acting on a stiction-locked, over-determined 9-support ring. A thermo-mechanical FE model with realistic sector temperature spreads and the measured/assumed slot states is required to size these internal loads and confirm they stay within the VVGS toroidal capacity.</w:t>
+            </w:r>
+          </w:p>
+        </w:tc>
+      </w:tr>
+    </w:tbl>
+    <w:p>
+      <w:pPr>
+        <w:spacing w:after="40"/>
+      </w:pPr>
+    </w:p>
+    <w:p>
+      <w:pPr>
+        <w:spacing w:before="320" w:after="80"/>
+        <w:pBdr>
+          <w:bottom w:val="single" w:sz="6" w:space="2" w:color="2b5797"/>
+        </w:pBdr>
+      </w:pPr>
+      <w:r>
+        <w:rPr>
+          <w:b/>
+          <w:color w:val="2B5797"/>
+          <w:sz w:val="28"/>
+        </w:rPr>
+        <w:t>12 — Reliability of the Gap Distribution &amp; the Case for Measurement</w:t>
+      </w:r>
+    </w:p>
+    <w:p>
+      <w:pPr>
+        <w:spacing w:after="120"/>
+      </w:pPr>
+      <w:r>
+        <w:rPr>
+          <w:b w:val="0"/>
+          <w:sz w:val="21"/>
+        </w:rPr>
+        <w:t>The statistics in §5–§6 rest on one weak assumption: that each support's offset is an independent draw from Uniform(−1.5 mm, +1.5 mm). Neither part is justified — the real gaps are the product of an assembly sequence, not a random process, and there is no evidence the range is ±1.5 mm or the shape uniform. A different but equally defensible prior moves the percentiles materially, so P95/P99 carry little weight.</w:t>
+      </w:r>
+    </w:p>
+    <w:tbl>
+      <w:tblPr>
+        <w:tblW w:type="auto" w:w="0"/>
+        <w:jc w:val="center"/>
+        <w:tblLook w:firstColumn="1" w:firstRow="1" w:lastColumn="0" w:lastRow="0" w:noHBand="0" w:noVBand="1" w:val="04A0"/>
+      </w:tblPr>
+      <w:tblGrid>
+        <w:gridCol w:w="2880"/>
+        <w:gridCol w:w="2880"/>
+        <w:gridCol w:w="2880"/>
+      </w:tblGrid>
+      <w:tr>
+        <w:tc>
+          <w:tcPr>
+            <w:tcW w:type="dxa" w:w="2880"/>
+            <w:tcBorders>
+              <w:top w:val="single" w:sz="8" w:color="888888"/>
+              <w:bottom w:val="single" w:sz="6" w:color="888888"/>
+              <w:left w:val="nil"/>
+              <w:right w:val="nil"/>
+            </w:tcBorders>
+          </w:tcPr>
+          <w:p>
+            <w:pPr>
+              <w:spacing w:before="0" w:after="40"/>
+            </w:pPr>
+            <w:r>
+              <w:rPr>
+                <w:b/>
+                <w:color w:val="1A3A6E"/>
+                <w:sz w:val="20"/>
+              </w:rPr>
+              <w:t>Result</w:t>
+            </w:r>
+          </w:p>
+        </w:tc>
+        <w:tc>
+          <w:tcPr>
+            <w:tcW w:type="dxa" w:w="2880"/>
+            <w:tcBorders>
+              <w:top w:val="single" w:sz="8" w:color="888888"/>
+              <w:bottom w:val="single" w:sz="6" w:color="888888"/>
+              <w:left w:val="nil"/>
+              <w:right w:val="nil"/>
+            </w:tcBorders>
+          </w:tcPr>
+          <w:p>
+            <w:pPr>
+              <w:spacing w:before="0" w:after="40"/>
+            </w:pPr>
+            <w:r>
+              <w:rPr>
+                <w:b/>
+                <w:color w:val="1A3A6E"/>
+                <w:sz w:val="20"/>
+              </w:rPr>
+              <w:t>Depends on the gap distribution?</w:t>
+            </w:r>
+          </w:p>
+        </w:tc>
+        <w:tc>
+          <w:tcPr>
+            <w:tcW w:type="dxa" w:w="2880"/>
+            <w:tcBorders>
+              <w:top w:val="single" w:sz="8" w:color="888888"/>
+              <w:bottom w:val="single" w:sz="6" w:color="888888"/>
+              <w:left w:val="nil"/>
+              <w:right w:val="nil"/>
+            </w:tcBorders>
+          </w:tcPr>
+          <w:p>
+            <w:pPr>
+              <w:spacing w:before="0" w:after="40"/>
+            </w:pPr>
+            <w:r>
+              <w:rPr>
+                <w:b/>
+                <w:color w:val="1A3A6E"/>
+                <w:sz w:val="20"/>
+              </w:rPr>
+              <w:t>Confidence</w:t>
+            </w:r>
+          </w:p>
+        </w:tc>
+      </w:tr>
+      <w:tr>
+        <w:tc>
+          <w:tcPr>
+            <w:tcW w:type="dxa" w:w="2880"/>
+            <w:tcBorders>
+              <w:top w:val="nil"/>
+              <w:bottom w:val="nil"/>
+              <w:left w:val="nil"/>
+              <w:right w:val="nil"/>
+            </w:tcBorders>
+          </w:tcPr>
+          <w:p>
+            <w:pPr>
+              <w:spacing w:before="0" w:after="40"/>
+            </w:pPr>
+            <w:r>
+              <w:rPr>
+                <w:b/>
+                <w:sz w:val="20"/>
+              </w:rPr>
+              <w:t>Nominal centred envelope (1.55 mm)</w:t>
+            </w:r>
+          </w:p>
+        </w:tc>
+        <w:tc>
+          <w:tcPr>
+            <w:tcW w:type="dxa" w:w="2880"/>
+            <w:tcBorders>
+              <w:top w:val="nil"/>
+              <w:bottom w:val="nil"/>
+              <w:left w:val="nil"/>
+              <w:right w:val="nil"/>
+            </w:tcBorders>
+          </w:tcPr>
+          <w:p>
+            <w:pPr>
+              <w:spacing w:before="0" w:after="40"/>
+            </w:pPr>
+            <w:r>
+              <w:rPr>
+                <w:sz w:val="20"/>
+              </w:rPr>
+              <w:t>No — geometry + slot</w:t>
+            </w:r>
+          </w:p>
+        </w:tc>
+        <w:tc>
+          <w:tcPr>
+            <w:tcW w:type="dxa" w:w="2880"/>
+            <w:tcBorders>
+              <w:top w:val="nil"/>
+              <w:bottom w:val="nil"/>
+              <w:left w:val="nil"/>
+              <w:right w:val="nil"/>
+            </w:tcBorders>
+          </w:tcPr>
+          <w:p>
+            <w:pPr>
+              <w:spacing w:before="0" w:after="40"/>
+            </w:pPr>
+            <w:r>
+              <w:rPr>
+                <w:sz w:val="20"/>
+              </w:rPr>
+              <w:t>HIGH</w:t>
+            </w:r>
+          </w:p>
+        </w:tc>
+      </w:tr>
+      <w:tr>
+        <w:tc>
+          <w:tcPr>
+            <w:tcW w:type="dxa" w:w="2880"/>
+            <w:tcBorders>
+              <w:top w:val="nil"/>
+              <w:bottom w:val="nil"/>
+              <w:left w:val="nil"/>
+              <w:right w:val="nil"/>
+            </w:tcBorders>
+          </w:tcPr>
+          <w:p>
+            <w:pPr>
+              <w:spacing w:before="0" w:after="40"/>
+            </w:pPr>
+            <w:r>
+              <w:rPr>
+                <w:b/>
+                <w:sz w:val="20"/>
+              </w:rPr>
+              <w:t>Polytope-width ceiling (3.09 mm)</w:t>
+            </w:r>
+          </w:p>
+        </w:tc>
+        <w:tc>
+          <w:tcPr>
+            <w:tcW w:type="dxa" w:w="2880"/>
+            <w:tcBorders>
+              <w:top w:val="nil"/>
+              <w:bottom w:val="nil"/>
+              <w:left w:val="nil"/>
+              <w:right w:val="nil"/>
+            </w:tcBorders>
+          </w:tcPr>
+          <w:p>
+            <w:pPr>
+              <w:spacing w:before="0" w:after="40"/>
+            </w:pPr>
+            <w:r>
+              <w:rPr>
+                <w:sz w:val="20"/>
+              </w:rPr>
+              <w:t>No — geometry + slot</w:t>
+            </w:r>
+          </w:p>
+        </w:tc>
+        <w:tc>
+          <w:tcPr>
+            <w:tcW w:type="dxa" w:w="2880"/>
+            <w:tcBorders>
+              <w:top w:val="nil"/>
+              <w:bottom w:val="nil"/>
+              <w:left w:val="nil"/>
+              <w:right w:val="nil"/>
+            </w:tcBorders>
+          </w:tcPr>
+          <w:p>
+            <w:pPr>
+              <w:spacing w:before="0" w:after="40"/>
+            </w:pPr>
+            <w:r>
+              <w:rPr>
+                <w:sz w:val="20"/>
+              </w:rPr>
+              <w:t>HIGH</w:t>
+            </w:r>
+          </w:p>
+        </w:tc>
+      </w:tr>
+      <w:tr>
+        <w:tc>
+          <w:tcPr>
+            <w:tcW w:type="dxa" w:w="2880"/>
+            <w:tcBorders>
+              <w:top w:val="nil"/>
+              <w:bottom w:val="nil"/>
+              <w:left w:val="nil"/>
+              <w:right w:val="nil"/>
+            </w:tcBorders>
+          </w:tcPr>
+          <w:p>
+            <w:pPr>
+              <w:spacing w:before="0" w:after="40"/>
+            </w:pPr>
+            <w:r>
+              <w:rPr>
+                <w:b/>
+                <w:sz w:val="20"/>
+              </w:rPr>
+              <w:t>Stiction ≫ centring (~1000×) &amp; walk verdict</w:t>
+            </w:r>
+          </w:p>
+        </w:tc>
+        <w:tc>
+          <w:tcPr>
+            <w:tcW w:type="dxa" w:w="2880"/>
+            <w:tcBorders>
+              <w:top w:val="nil"/>
+              <w:bottom w:val="nil"/>
+              <w:left w:val="nil"/>
+              <w:right w:val="nil"/>
+            </w:tcBorders>
+          </w:tcPr>
+          <w:p>
+            <w:pPr>
+              <w:spacing w:before="0" w:after="40"/>
+            </w:pPr>
+            <w:r>
+              <w:rPr>
+                <w:sz w:val="20"/>
+              </w:rPr>
+              <w:t>No — force comparison</w:t>
+            </w:r>
+          </w:p>
+        </w:tc>
+        <w:tc>
+          <w:tcPr>
+            <w:tcW w:type="dxa" w:w="2880"/>
+            <w:tcBorders>
+              <w:top w:val="nil"/>
+              <w:bottom w:val="nil"/>
+              <w:left w:val="nil"/>
+              <w:right w:val="nil"/>
+            </w:tcBorders>
+          </w:tcPr>
+          <w:p>
+            <w:pPr>
+              <w:spacing w:before="0" w:after="40"/>
+            </w:pPr>
+            <w:r>
+              <w:rPr>
+                <w:sz w:val="20"/>
+              </w:rPr>
+              <w:t>HIGH</w:t>
+            </w:r>
+          </w:p>
+        </w:tc>
+      </w:tr>
+      <w:tr>
+        <w:tc>
+          <w:tcPr>
+            <w:tcW w:type="dxa" w:w="2880"/>
+            <w:tcBorders>
+              <w:top w:val="nil"/>
+              <w:bottom w:val="nil"/>
+              <w:left w:val="nil"/>
+              <w:right w:val="nil"/>
+            </w:tcBorders>
+          </w:tcPr>
+          <w:p>
+            <w:pPr>
+              <w:spacing w:before="0" w:after="40"/>
+            </w:pPr>
+            <w:r>
+              <w:rPr>
+                <w:b/>
+                <w:sz w:val="20"/>
+              </w:rPr>
+              <w:t>Thermal no-recentring verdict</w:t>
+            </w:r>
+          </w:p>
+        </w:tc>
+        <w:tc>
+          <w:tcPr>
+            <w:tcW w:type="dxa" w:w="2880"/>
+            <w:tcBorders>
+              <w:top w:val="nil"/>
+              <w:bottom w:val="nil"/>
+              <w:left w:val="nil"/>
+              <w:right w:val="nil"/>
+            </w:tcBorders>
+          </w:tcPr>
+          <w:p>
+            <w:pPr>
+              <w:spacing w:before="0" w:after="40"/>
+            </w:pPr>
+            <w:r>
+              <w:rPr>
+                <w:sz w:val="20"/>
+              </w:rPr>
+              <w:t>No — force comparison</w:t>
+            </w:r>
+          </w:p>
+        </w:tc>
+        <w:tc>
+          <w:tcPr>
+            <w:tcW w:type="dxa" w:w="2880"/>
+            <w:tcBorders>
+              <w:top w:val="nil"/>
+              <w:bottom w:val="nil"/>
+              <w:left w:val="nil"/>
+              <w:right w:val="nil"/>
+            </w:tcBorders>
+          </w:tcPr>
+          <w:p>
+            <w:pPr>
+              <w:spacing w:before="0" w:after="40"/>
+            </w:pPr>
+            <w:r>
+              <w:rPr>
+                <w:sz w:val="20"/>
+              </w:rPr>
+              <w:t>HIGH</w:t>
+            </w:r>
+          </w:p>
+        </w:tc>
+      </w:tr>
+      <w:tr>
+        <w:tc>
+          <w:tcPr>
+            <w:tcW w:type="dxa" w:w="2880"/>
+            <w:tcBorders>
+              <w:top w:val="nil"/>
+              <w:bottom w:val="single" w:sz="8" w:color="888888"/>
+              <w:left w:val="nil"/>
+              <w:right w:val="nil"/>
+            </w:tcBorders>
+          </w:tcPr>
+          <w:p>
+            <w:pPr>
+              <w:spacing w:before="0" w:after="40"/>
+            </w:pPr>
+            <w:r>
+              <w:rPr>
+                <w:b/>
+                <w:sz w:val="20"/>
+              </w:rPr>
+              <w:t>MC percentiles (P95 = 2.27 mm, etc.)</w:t>
+            </w:r>
+          </w:p>
+        </w:tc>
+        <w:tc>
+          <w:tcPr>
+            <w:tcW w:type="dxa" w:w="2880"/>
+            <w:tcBorders>
+              <w:top w:val="nil"/>
+              <w:bottom w:val="single" w:sz="8" w:color="888888"/>
+              <w:left w:val="nil"/>
+              <w:right w:val="nil"/>
+            </w:tcBorders>
+          </w:tcPr>
+          <w:p>
+            <w:pPr>
+              <w:spacing w:before="0" w:after="40"/>
+            </w:pPr>
+            <w:r>
+              <w:rPr>
+                <w:sz w:val="20"/>
+              </w:rPr>
+              <w:t>Yes — strongly</w:t>
+            </w:r>
+          </w:p>
+        </w:tc>
+        <w:tc>
+          <w:tcPr>
+            <w:tcW w:type="dxa" w:w="2880"/>
+            <w:tcBorders>
+              <w:top w:val="nil"/>
+              <w:bottom w:val="single" w:sz="8" w:color="888888"/>
+              <w:left w:val="nil"/>
+              <w:right w:val="nil"/>
+            </w:tcBorders>
+          </w:tcPr>
+          <w:p>
+            <w:pPr>
+              <w:spacing w:before="0" w:after="40"/>
+            </w:pPr>
+            <w:r>
+              <w:rPr>
+                <w:sz w:val="20"/>
+              </w:rPr>
+              <w:t>LOW</w:t>
+            </w:r>
+          </w:p>
+        </w:tc>
+      </w:tr>
+    </w:tbl>
+    <w:p>
+      <w:pPr>
+        <w:spacing w:after="80"/>
+      </w:pPr>
+    </w:p>
+    <w:tbl>
+      <w:tblPr>
+        <w:tblW w:type="auto" w:w="0"/>
+        <w:jc w:val="center"/>
+        <w:tblLook w:firstColumn="1" w:firstRow="1" w:lastColumn="0" w:lastRow="0" w:noHBand="0" w:noVBand="1" w:val="04A0"/>
+      </w:tblPr>
+      <w:tblGrid>
+        <w:gridCol w:w="8640"/>
+      </w:tblGrid>
+      <w:tr>
+        <w:tc>
+          <w:tcPr>
+            <w:tcW w:type="dxa" w:w="8640"/>
+            <w:shd w:val="clear" w:fill="edf8ed"/>
+            <w:tcBorders>
+              <w:left w:val="single" w:sz="24" w:color="2a8a2a"/>
+            </w:tcBorders>
+            <w:tcBorders>
+              <w:top w:val="single" w:sz="4" w:color="edf8ed"/>
+              <w:bottom w:val="single" w:sz="4" w:color="edf8ed"/>
+              <w:right w:val="single" w:sz="4" w:color="edf8ed"/>
+            </w:tcBorders>
+          </w:tcPr>
+          <w:p>
+            <w:pPr>
+              <w:spacing w:before="0" w:after="40"/>
+            </w:pPr>
+            <w:r>
+              <w:rPr>
+                <w:b/>
+                <w:color w:val="2A8A2A"/>
+              </w:rPr>
+              <w:t xml:space="preserve">Recommendation: measure, don't propagate.  </w:t>
+            </w:r>
+            <w:r>
+              <w:rPr>
+                <w:b w:val="0"/>
+                <w:sz w:val="20"/>
+              </w:rPr>
+              <w:t>Because the conclusions that matter are distribution-free, and the only distribution-dependent outputs are the unreliable percentiles, the highest-value action is to measure the nine VVGS gaps directly with feeler gauges. Nine measurements turn the problem into a deterministic kinematic calculation — the exact polytope, its width, and the as-built offset of the vessel centre — with no prior to defend. As the reviewer notes, this is also less effort than building and justifying an input-uncertainty model. Each measured gap also tightens the conditional bound (§6); nine collapse it entirely.</w:t>
+            </w:r>
+          </w:p>
+        </w:tc>
+      </w:tr>
+    </w:tbl>
+    <w:p>
+      <w:pPr>
+        <w:spacing w:after="40"/>
+      </w:pPr>
+    </w:p>
+    <w:p>
+      <w:pPr>
+        <w:spacing w:before="320" w:after="80"/>
+        <w:pBdr>
+          <w:bottom w:val="single" w:sz="6" w:space="2" w:color="2b5797"/>
+        </w:pBdr>
+      </w:pPr>
+      <w:r>
+        <w:rPr>
+          <w:b/>
+          <w:color w:val="2B5797"/>
+          <w:sz w:val="28"/>
+        </w:rPr>
+        <w:t>13 — The 6 mm n ≤ 4 First-Wall Budget</w:t>
       </w:r>
     </w:p>
     <w:p>
@@ -2997,7 +4588,7 @@
           <w:b w:val="0"/>
           <w:sz w:val="21"/>
         </w:rPr>
-        <w:t>. The VV n = 1 lateral displacement, quantified in §5, is one contributor to the first-wall side of this inequality:</w:t>
+        <w:t>. The VV n = 1 lateral displacement is one contributor — and the two bounds (§10) give two very different answers:</w:t>
       </w:r>
     </w:p>
     <w:tbl>
@@ -3031,7 +4622,7 @@
                 <w:color w:val="1A3A6E"/>
                 <w:sz w:val="20"/>
               </w:rPr>
-              <w:t>Operating condition</w:t>
+              <w:t>Picture</w:t>
             </w:r>
           </w:p>
         </w:tc>
@@ -3080,7 +4671,7 @@
                 <w:b/>
                 <w:sz w:val="20"/>
               </w:rPr>
-              <w:t>Quiescent / between shots (no lateral load)</w:t>
+              <w:t>Frictionless self-centring — at rest, between shots</w:t>
             </w:r>
           </w:p>
         </w:tc>
@@ -3102,7 +4693,7 @@
               <w:rPr>
                 <w:sz w:val="20"/>
               </w:rPr>
-              <w:t>≈ 0 mm (self-centred)</w:t>
+              <w:t>≈ 0 mm</w:t>
             </w:r>
           </w:p>
         </w:tc>
@@ -3149,7 +4740,7 @@
               <w:rPr>
                 <w:sz w:val="20"/>
               </w:rPr>
-              <w:t>net reduces mismatch</w:t>
+              <w:t>net reduces mismatch (kN, no slide)</w:t>
             </w:r>
           </w:p>
         </w:tc>
@@ -3174,7 +4765,7 @@
                 <w:b/>
                 <w:sz w:val="20"/>
               </w:rPr>
-              <w:t>Steady asymmetric thermal/EM loads</w:t>
+              <w:t>From-centre kinematic worst (forced, frictionless)</w:t>
             </w:r>
           </w:p>
         </w:tc>
@@ -3196,54 +4787,7 @@
               <w:rPr>
                 <w:sz w:val="20"/>
               </w:rPr>
-              <w:t>F/K — sub-mm</w:t>
-            </w:r>
-          </w:p>
-        </w:tc>
-      </w:tr>
-      <w:tr>
-        <w:tc>
-          <w:tcPr>
-            <w:tcW w:type="dxa" w:w="4320"/>
-            <w:tcBorders>
-              <w:top w:val="nil"/>
-              <w:bottom w:val="nil"/>
-              <w:left w:val="nil"/>
-              <w:right w:val="nil"/>
-            </w:tcBorders>
-          </w:tcPr>
-          <w:p>
-            <w:pPr>
-              <w:spacing w:before="0" w:after="40"/>
-            </w:pPr>
-            <w:r>
-              <w:rPr>
-                <w:b/>
-                <w:sz w:val="20"/>
-              </w:rPr>
-              <w:t>Disruption transient (forced)</w:t>
-            </w:r>
-          </w:p>
-        </w:tc>
-        <w:tc>
-          <w:tcPr>
-            <w:tcW w:type="dxa" w:w="4320"/>
-            <w:tcBorders>
-              <w:top w:val="nil"/>
-              <w:bottom w:val="nil"/>
-              <w:left w:val="nil"/>
-              <w:right w:val="nil"/>
-            </w:tcBorders>
-          </w:tcPr>
-          <w:p>
-            <w:pPr>
-              <w:spacing w:before="0" w:after="40"/>
-            </w:pPr>
-            <w:r>
-              <w:rPr>
-                <w:sz w:val="20"/>
-              </w:rPr>
-              <w:t>up to gap (1.5 mm) + dynamic overshoot</w:t>
+              <w:t>≈ 2.98 mm</w:t>
             </w:r>
           </w:p>
         </w:tc>
@@ -3268,7 +4812,7 @@
                 <w:b/>
                 <w:sz w:val="20"/>
               </w:rPr>
-              <w:t>Kinematic ceiling (worst random assembly, fully forced)</w:t>
+              <w:t>Stiction walk — realistic worst case (polytope width)</w:t>
             </w:r>
           </w:p>
         </w:tc>
@@ -3290,7 +4834,7 @@
               <w:rPr>
                 <w:sz w:val="20"/>
               </w:rPr>
-              <w:t>≈ 2.98 mm</w:t>
+              <w:t>≈ 3.1 mm</w:t>
             </w:r>
           </w:p>
         </w:tc>
@@ -3314,14 +4858,14 @@
         <w:tc>
           <w:tcPr>
             <w:tcW w:type="dxa" w:w="8640"/>
-            <w:shd w:val="clear" w:fill="e8efff"/>
+            <w:shd w:val="clear" w:fill="fff0ee"/>
             <w:tcBorders>
-              <w:left w:val="single" w:sz="24" w:color="2255aa"/>
+              <w:left w:val="single" w:sz="24" w:color="cc2200"/>
             </w:tcBorders>
             <w:tcBorders>
-              <w:top w:val="single" w:sz="4" w:color="e8efff"/>
-              <w:bottom w:val="single" w:sz="4" w:color="e8efff"/>
-              <w:right w:val="single" w:sz="4" w:color="e8efff"/>
+              <w:top w:val="single" w:sz="4" w:color="fff0ee"/>
+              <w:bottom w:val="single" w:sz="4" w:color="fff0ee"/>
+              <w:right w:val="single" w:sz="4" w:color="fff0ee"/>
             </w:tcBorders>
           </w:tcPr>
           <w:p>
@@ -3330,10 +4874,67 @@
             </w:pPr>
             <w:r>
               <w:rPr>
+                <w:b/>
+                <w:color w:val="CC2200"/>
+              </w:rPr>
+              <w:t xml:space="preserve">The realistic VV n = 1 contribution is up to ≈ 3 mm — about half the 6 mm budget — not ≈ 0.  </w:t>
+            </w:r>
+            <w:r>
+              <w:rPr>
                 <w:b w:val="0"/>
                 <w:sz w:val="20"/>
               </w:rPr>
-              <w:t>Under nominal start-up conditions the VV n = 1 contribution is small and favourable (it closes the misalignment). The remaining ~3–6 mm of the budget is available for the toroidal-field side (mainly TF vault closure n ≤ 4) and any other first-wall n ≤ 4 contributors.</w:t>
+              <w:t>Because stiction prevents self-centring (§10), the vessel sits wherever it was last driven, anywhere within the ±-width polytope, until the gaps are measured or the supports are shimmed. The optimistic ≈ 0 mm (self-centred) value should not be assumed for the budget. The remaining ~3 mm is what is then available for the toroidal-field side (mainly TF vault closure n ≤ 4) and other first-wall contributors — a materially tighter allocation than the self-centred picture implies.</w:t>
+            </w:r>
+          </w:p>
+        </w:tc>
+      </w:tr>
+    </w:tbl>
+    <w:p>
+      <w:pPr>
+        <w:spacing w:after="40"/>
+      </w:pPr>
+    </w:p>
+    <w:tbl>
+      <w:tblPr>
+        <w:tblW w:type="auto" w:w="0"/>
+        <w:jc w:val="center"/>
+        <w:tblLook w:firstColumn="1" w:firstRow="1" w:lastColumn="0" w:lastRow="0" w:noHBand="0" w:noVBand="1" w:val="04A0"/>
+      </w:tblPr>
+      <w:tblGrid>
+        <w:gridCol w:w="8640"/>
+      </w:tblGrid>
+      <w:tr>
+        <w:tc>
+          <w:tcPr>
+            <w:tcW w:type="dxa" w:w="8640"/>
+            <w:shd w:val="clear" w:fill="edf8ed"/>
+            <w:tcBorders>
+              <w:left w:val="single" w:sz="24" w:color="2a8a2a"/>
+            </w:tcBorders>
+            <w:tcBorders>
+              <w:top w:val="single" w:sz="4" w:color="edf8ed"/>
+              <w:bottom w:val="single" w:sz="4" w:color="edf8ed"/>
+              <w:right w:val="single" w:sz="4" w:color="edf8ed"/>
+            </w:tcBorders>
+          </w:tcPr>
+          <w:p>
+            <w:pPr>
+              <w:spacing w:before="0" w:after="40"/>
+            </w:pPr>
+            <w:r>
+              <w:rPr>
+                <w:b/>
+                <w:color w:val="2A8A2A"/>
+              </w:rPr>
+              <w:t xml:space="preserve">How to recover budget.  </w:t>
+            </w:r>
+            <w:r>
+              <w:rPr>
+                <w:b w:val="0"/>
+                <w:sz w:val="20"/>
+              </w:rPr>
+              <w:t>Measuring the nine gaps (§12) removes the distribution uncertainty and quantifies the as-built offset; shimming a support fixes its u_i and shrinks the reachable polytope (§6), pulling the realistic contribution back toward the nominal envelope. These are deterministic, low-effort levers — far more reliable than the unvalidated statistical bound.</w:t>
             </w:r>
           </w:p>
         </w:tc>
@@ -3350,7 +4951,7 @@
           <w:color w:val="555555"/>
           <w:sz w:val="16"/>
         </w:rPr>
-        <w:t>Author: Simon McIntosh. Monte Carlo data generated reproducibly by vv_mc_generator.py (scipy HiGHS LP, max-lateral-displacement-from-centre metric, N = 5000, fixed seed 20260527 → committed data/). Figures and animations by vv_viz.py; displacements magnified ×500. Centring parameters: M ≈ 8000 t, 15° inclined dual hinge → L_eff ≈ 26 m → K ≈ 3 kN/mm, T_n ≈ 10 s, F_stop ≈ 4.5 kN. Every number regenerates from the repository. Source: Simon-McIntosh/vv.</w:t>
+        <w:t>Author: Simon McIntosh. Monte-Carlo data generated reproducibly by vv_mc_generator.py (scipy HiGHS LP, fixed seed 20260527 → committed data/). Departure-from-centre and polytope-width figures/animations by vv_viz.py and vv_rattle_figures.py; the stiction/thermal force ledger by vv_mechanics.py; displacements magnified ×500. Geometry &amp; centring (ITER VV Load Spec + mass table, ITER_D_6TLUDY): R_s ≈ 10 m, M ≈ 9000 t, 15° inclined dual-hinge → L_eff ≈ 26–32 m → K ≈ 2.7 kN/mm, T_n ≈ 11 s, F_stop ≈ 4.1 kN; per-VVGS dead-weight axial ≈ 10 MN, toroidal breakaway ≈ 1 MN. Every number regenerates from the repository. Source: Simon-McIntosh/vv.</w:t>
       </w:r>
     </w:p>
     <w:sectPr>

</xml_diff>